<commit_message>
StockBroker: republish BRS v0.2 with data appendix
- Business Requirements Specification v0.2 (draft): new Appendix D
  summarising the SQL inventory (shared database, 8 tables, review
  status, data written by more than one component as business risk).
- Regenerated Word and PDF exports.
- Wiki preview refreshed (top page and specification page); pushed to
  the ADO wiki: 5 pages created, 2 updated.

Completeness check: 96/96 rules, 21/21 questions, 19/19 defects.

Co-Authored-By: Claude Opus 5.5 <noreply@anthropic.com>
</commit_message>
<xml_diff>
--- a/projects/stockbroker/deliverables/Business-Requirements-Specification.docx
+++ b/projects/stockbroker/deliverables/Business-Requirements-Specification.docx
@@ -54,7 +54,7 @@
       <w:r>
         <w:fldChar w:fldCharType="separate"/>
       </w:r>
-      <w:hyperlink w:anchor="_Toc242020121" w:history="1">
+      <w:hyperlink w:anchor="_Toc242023941" w:history="1">
         <w:r>
           <w:rPr>
             <w:rStyle w:val="Hyperlink"/>
@@ -81,7 +81,7 @@
             <w:noProof/>
             <w:webHidden/>
           </w:rPr>
-          <w:instrText xml:space="preserve"> PAGEREF _Toc242020121 \h </w:instrText>
+          <w:instrText xml:space="preserve"> PAGEREF _Toc242023941 \h </w:instrText>
         </w:r>
         <w:r>
           <w:rPr>
@@ -128,7 +128,7 @@
           <w14:ligatures w14:val="standardContextual"/>
         </w:rPr>
       </w:pPr>
-      <w:hyperlink w:anchor="_Toc242020122" w:history="1">
+      <w:hyperlink w:anchor="_Toc242023942" w:history="1">
         <w:r>
           <w:rPr>
             <w:rStyle w:val="Hyperlink"/>
@@ -155,7 +155,7 @@
             <w:noProof/>
             <w:webHidden/>
           </w:rPr>
-          <w:instrText xml:space="preserve"> PAGEREF _Toc242020122 \h </w:instrText>
+          <w:instrText xml:space="preserve"> PAGEREF _Toc242023942 \h </w:instrText>
         </w:r>
         <w:r>
           <w:rPr>
@@ -202,7 +202,7 @@
           <w14:ligatures w14:val="standardContextual"/>
         </w:rPr>
       </w:pPr>
-      <w:hyperlink w:anchor="_Toc242020123" w:history="1">
+      <w:hyperlink w:anchor="_Toc242023943" w:history="1">
         <w:r>
           <w:rPr>
             <w:rStyle w:val="Hyperlink"/>
@@ -229,7 +229,7 @@
             <w:noProof/>
             <w:webHidden/>
           </w:rPr>
-          <w:instrText xml:space="preserve"> PAGEREF _Toc242020123 \h </w:instrText>
+          <w:instrText xml:space="preserve"> PAGEREF _Toc242023943 \h </w:instrText>
         </w:r>
         <w:r>
           <w:rPr>
@@ -276,7 +276,7 @@
           <w14:ligatures w14:val="standardContextual"/>
         </w:rPr>
       </w:pPr>
-      <w:hyperlink w:anchor="_Toc242020124" w:history="1">
+      <w:hyperlink w:anchor="_Toc242023944" w:history="1">
         <w:r>
           <w:rPr>
             <w:rStyle w:val="Hyperlink"/>
@@ -303,7 +303,7 @@
             <w:noProof/>
             <w:webHidden/>
           </w:rPr>
-          <w:instrText xml:space="preserve"> PAGEREF _Toc242020124 \h </w:instrText>
+          <w:instrText xml:space="preserve"> PAGEREF _Toc242023944 \h </w:instrText>
         </w:r>
         <w:r>
           <w:rPr>
@@ -350,7 +350,7 @@
           <w14:ligatures w14:val="standardContextual"/>
         </w:rPr>
       </w:pPr>
-      <w:hyperlink w:anchor="_Toc242020125" w:history="1">
+      <w:hyperlink w:anchor="_Toc242023945" w:history="1">
         <w:r>
           <w:rPr>
             <w:rStyle w:val="Hyperlink"/>
@@ -377,7 +377,7 @@
             <w:noProof/>
             <w:webHidden/>
           </w:rPr>
-          <w:instrText xml:space="preserve"> PAGEREF _Toc242020125 \h </w:instrText>
+          <w:instrText xml:space="preserve"> PAGEREF _Toc242023945 \h </w:instrText>
         </w:r>
         <w:r>
           <w:rPr>
@@ -424,7 +424,7 @@
           <w14:ligatures w14:val="standardContextual"/>
         </w:rPr>
       </w:pPr>
-      <w:hyperlink w:anchor="_Toc242020126" w:history="1">
+      <w:hyperlink w:anchor="_Toc242023946" w:history="1">
         <w:r>
           <w:rPr>
             <w:rStyle w:val="Hyperlink"/>
@@ -451,7 +451,7 @@
             <w:noProof/>
             <w:webHidden/>
           </w:rPr>
-          <w:instrText xml:space="preserve"> PAGEREF _Toc242020126 \h </w:instrText>
+          <w:instrText xml:space="preserve"> PAGEREF _Toc242023946 \h </w:instrText>
         </w:r>
         <w:r>
           <w:rPr>
@@ -498,7 +498,7 @@
           <w14:ligatures w14:val="standardContextual"/>
         </w:rPr>
       </w:pPr>
-      <w:hyperlink w:anchor="_Toc242020127" w:history="1">
+      <w:hyperlink w:anchor="_Toc242023947" w:history="1">
         <w:r>
           <w:rPr>
             <w:rStyle w:val="Hyperlink"/>
@@ -525,7 +525,7 @@
             <w:noProof/>
             <w:webHidden/>
           </w:rPr>
-          <w:instrText xml:space="preserve"> PAGEREF _Toc242020127 \h </w:instrText>
+          <w:instrText xml:space="preserve"> PAGEREF _Toc242023947 \h </w:instrText>
         </w:r>
         <w:r>
           <w:rPr>
@@ -572,7 +572,7 @@
           <w14:ligatures w14:val="standardContextual"/>
         </w:rPr>
       </w:pPr>
-      <w:hyperlink w:anchor="_Toc242020128" w:history="1">
+      <w:hyperlink w:anchor="_Toc242023948" w:history="1">
         <w:r>
           <w:rPr>
             <w:rStyle w:val="Hyperlink"/>
@@ -599,7 +599,7 @@
             <w:noProof/>
             <w:webHidden/>
           </w:rPr>
-          <w:instrText xml:space="preserve"> PAGEREF _Toc242020128 \h </w:instrText>
+          <w:instrText xml:space="preserve"> PAGEREF _Toc242023948 \h </w:instrText>
         </w:r>
         <w:r>
           <w:rPr>
@@ -646,7 +646,7 @@
           <w14:ligatures w14:val="standardContextual"/>
         </w:rPr>
       </w:pPr>
-      <w:hyperlink w:anchor="_Toc242020129" w:history="1">
+      <w:hyperlink w:anchor="_Toc242023949" w:history="1">
         <w:r>
           <w:rPr>
             <w:rStyle w:val="Hyperlink"/>
@@ -673,7 +673,7 @@
             <w:noProof/>
             <w:webHidden/>
           </w:rPr>
-          <w:instrText xml:space="preserve"> PAGEREF _Toc242020129 \h </w:instrText>
+          <w:instrText xml:space="preserve"> PAGEREF _Toc242023949 \h </w:instrText>
         </w:r>
         <w:r>
           <w:rPr>
@@ -720,7 +720,7 @@
           <w14:ligatures w14:val="standardContextual"/>
         </w:rPr>
       </w:pPr>
-      <w:hyperlink w:anchor="_Toc242020130" w:history="1">
+      <w:hyperlink w:anchor="_Toc242023950" w:history="1">
         <w:r>
           <w:rPr>
             <w:rStyle w:val="Hyperlink"/>
@@ -747,7 +747,7 @@
             <w:noProof/>
             <w:webHidden/>
           </w:rPr>
-          <w:instrText xml:space="preserve"> PAGEREF _Toc242020130 \h </w:instrText>
+          <w:instrText xml:space="preserve"> PAGEREF _Toc242023950 \h </w:instrText>
         </w:r>
         <w:r>
           <w:rPr>
@@ -794,7 +794,7 @@
           <w14:ligatures w14:val="standardContextual"/>
         </w:rPr>
       </w:pPr>
-      <w:hyperlink w:anchor="_Toc242020131" w:history="1">
+      <w:hyperlink w:anchor="_Toc242023951" w:history="1">
         <w:r>
           <w:rPr>
             <w:rStyle w:val="Hyperlink"/>
@@ -821,7 +821,7 @@
             <w:noProof/>
             <w:webHidden/>
           </w:rPr>
-          <w:instrText xml:space="preserve"> PAGEREF _Toc242020131 \h </w:instrText>
+          <w:instrText xml:space="preserve"> PAGEREF _Toc242023951 \h </w:instrText>
         </w:r>
         <w:r>
           <w:rPr>
@@ -868,7 +868,7 @@
           <w14:ligatures w14:val="standardContextual"/>
         </w:rPr>
       </w:pPr>
-      <w:hyperlink w:anchor="_Toc242020132" w:history="1">
+      <w:hyperlink w:anchor="_Toc242023952" w:history="1">
         <w:r>
           <w:rPr>
             <w:rStyle w:val="Hyperlink"/>
@@ -895,7 +895,7 @@
             <w:noProof/>
             <w:webHidden/>
           </w:rPr>
-          <w:instrText xml:space="preserve"> PAGEREF _Toc242020132 \h </w:instrText>
+          <w:instrText xml:space="preserve"> PAGEREF _Toc242023952 \h </w:instrText>
         </w:r>
         <w:r>
           <w:rPr>
@@ -942,7 +942,7 @@
           <w14:ligatures w14:val="standardContextual"/>
         </w:rPr>
       </w:pPr>
-      <w:hyperlink w:anchor="_Toc242020133" w:history="1">
+      <w:hyperlink w:anchor="_Toc242023953" w:history="1">
         <w:r>
           <w:rPr>
             <w:rStyle w:val="Hyperlink"/>
@@ -969,7 +969,7 @@
             <w:noProof/>
             <w:webHidden/>
           </w:rPr>
-          <w:instrText xml:space="preserve"> PAGEREF _Toc242020133 \h </w:instrText>
+          <w:instrText xml:space="preserve"> PAGEREF _Toc242023953 \h </w:instrText>
         </w:r>
         <w:r>
           <w:rPr>
@@ -1016,7 +1016,7 @@
           <w14:ligatures w14:val="standardContextual"/>
         </w:rPr>
       </w:pPr>
-      <w:hyperlink w:anchor="_Toc242020134" w:history="1">
+      <w:hyperlink w:anchor="_Toc242023954" w:history="1">
         <w:r>
           <w:rPr>
             <w:rStyle w:val="Hyperlink"/>
@@ -1043,7 +1043,7 @@
             <w:noProof/>
             <w:webHidden/>
           </w:rPr>
-          <w:instrText xml:space="preserve"> PAGEREF _Toc242020134 \h </w:instrText>
+          <w:instrText xml:space="preserve"> PAGEREF _Toc242023954 \h </w:instrText>
         </w:r>
         <w:r>
           <w:rPr>
@@ -1090,7 +1090,7 @@
           <w14:ligatures w14:val="standardContextual"/>
         </w:rPr>
       </w:pPr>
-      <w:hyperlink w:anchor="_Toc242020135" w:history="1">
+      <w:hyperlink w:anchor="_Toc242023955" w:history="1">
         <w:r>
           <w:rPr>
             <w:rStyle w:val="Hyperlink"/>
@@ -1117,7 +1117,7 @@
             <w:noProof/>
             <w:webHidden/>
           </w:rPr>
-          <w:instrText xml:space="preserve"> PAGEREF _Toc242020135 \h </w:instrText>
+          <w:instrText xml:space="preserve"> PAGEREF _Toc242023955 \h </w:instrText>
         </w:r>
         <w:r>
           <w:rPr>
@@ -1164,7 +1164,7 @@
           <w14:ligatures w14:val="standardContextual"/>
         </w:rPr>
       </w:pPr>
-      <w:hyperlink w:anchor="_Toc242020136" w:history="1">
+      <w:hyperlink w:anchor="_Toc242023956" w:history="1">
         <w:r>
           <w:rPr>
             <w:rStyle w:val="Hyperlink"/>
@@ -1191,7 +1191,7 @@
             <w:noProof/>
             <w:webHidden/>
           </w:rPr>
-          <w:instrText xml:space="preserve"> PAGEREF _Toc242020136 \h </w:instrText>
+          <w:instrText xml:space="preserve"> PAGEREF _Toc242023956 \h </w:instrText>
         </w:r>
         <w:r>
           <w:rPr>
@@ -1238,7 +1238,7 @@
           <w14:ligatures w14:val="standardContextual"/>
         </w:rPr>
       </w:pPr>
-      <w:hyperlink w:anchor="_Toc242020137" w:history="1">
+      <w:hyperlink w:anchor="_Toc242023957" w:history="1">
         <w:r>
           <w:rPr>
             <w:rStyle w:val="Hyperlink"/>
@@ -1265,7 +1265,7 @@
             <w:noProof/>
             <w:webHidden/>
           </w:rPr>
-          <w:instrText xml:space="preserve"> PAGEREF _Toc242020137 \h </w:instrText>
+          <w:instrText xml:space="preserve"> PAGEREF _Toc242023957 \h </w:instrText>
         </w:r>
         <w:r>
           <w:rPr>
@@ -1312,7 +1312,7 @@
           <w14:ligatures w14:val="standardContextual"/>
         </w:rPr>
       </w:pPr>
-      <w:hyperlink w:anchor="_Toc242020138" w:history="1">
+      <w:hyperlink w:anchor="_Toc242023958" w:history="1">
         <w:r>
           <w:rPr>
             <w:rStyle w:val="Hyperlink"/>
@@ -1339,7 +1339,7 @@
             <w:noProof/>
             <w:webHidden/>
           </w:rPr>
-          <w:instrText xml:space="preserve"> PAGEREF _Toc242020138 \h </w:instrText>
+          <w:instrText xml:space="preserve"> PAGEREF _Toc242023958 \h </w:instrText>
         </w:r>
         <w:r>
           <w:rPr>
@@ -1386,7 +1386,7 @@
           <w14:ligatures w14:val="standardContextual"/>
         </w:rPr>
       </w:pPr>
-      <w:hyperlink w:anchor="_Toc242020139" w:history="1">
+      <w:hyperlink w:anchor="_Toc242023959" w:history="1">
         <w:r>
           <w:rPr>
             <w:rStyle w:val="Hyperlink"/>
@@ -1413,7 +1413,7 @@
             <w:noProof/>
             <w:webHidden/>
           </w:rPr>
-          <w:instrText xml:space="preserve"> PAGEREF _Toc242020139 \h </w:instrText>
+          <w:instrText xml:space="preserve"> PAGEREF _Toc242023959 \h </w:instrText>
         </w:r>
         <w:r>
           <w:rPr>
@@ -1460,7 +1460,7 @@
           <w14:ligatures w14:val="standardContextual"/>
         </w:rPr>
       </w:pPr>
-      <w:hyperlink w:anchor="_Toc242020140" w:history="1">
+      <w:hyperlink w:anchor="_Toc242023960" w:history="1">
         <w:r>
           <w:rPr>
             <w:rStyle w:val="Hyperlink"/>
@@ -1487,7 +1487,7 @@
             <w:noProof/>
             <w:webHidden/>
           </w:rPr>
-          <w:instrText xml:space="preserve"> PAGEREF _Toc242020140 \h </w:instrText>
+          <w:instrText xml:space="preserve"> PAGEREF _Toc242023960 \h </w:instrText>
         </w:r>
         <w:r>
           <w:rPr>
@@ -1534,7 +1534,7 @@
           <w14:ligatures w14:val="standardContextual"/>
         </w:rPr>
       </w:pPr>
-      <w:hyperlink w:anchor="_Toc242020141" w:history="1">
+      <w:hyperlink w:anchor="_Toc242023961" w:history="1">
         <w:r>
           <w:rPr>
             <w:rStyle w:val="Hyperlink"/>
@@ -1561,7 +1561,7 @@
             <w:noProof/>
             <w:webHidden/>
           </w:rPr>
-          <w:instrText xml:space="preserve"> PAGEREF _Toc242020141 \h </w:instrText>
+          <w:instrText xml:space="preserve"> PAGEREF _Toc242023961 \h </w:instrText>
         </w:r>
         <w:r>
           <w:rPr>
@@ -1608,7 +1608,7 @@
           <w14:ligatures w14:val="standardContextual"/>
         </w:rPr>
       </w:pPr>
-      <w:hyperlink w:anchor="_Toc242020142" w:history="1">
+      <w:hyperlink w:anchor="_Toc242023962" w:history="1">
         <w:r>
           <w:rPr>
             <w:rStyle w:val="Hyperlink"/>
@@ -1635,7 +1635,7 @@
             <w:noProof/>
             <w:webHidden/>
           </w:rPr>
-          <w:instrText xml:space="preserve"> PAGEREF _Toc242020142 \h </w:instrText>
+          <w:instrText xml:space="preserve"> PAGEREF _Toc242023962 \h </w:instrText>
         </w:r>
         <w:r>
           <w:rPr>
@@ -1682,7 +1682,7 @@
           <w14:ligatures w14:val="standardContextual"/>
         </w:rPr>
       </w:pPr>
-      <w:hyperlink w:anchor="_Toc242020143" w:history="1">
+      <w:hyperlink w:anchor="_Toc242023963" w:history="1">
         <w:r>
           <w:rPr>
             <w:rStyle w:val="Hyperlink"/>
@@ -1709,7 +1709,7 @@
             <w:noProof/>
             <w:webHidden/>
           </w:rPr>
-          <w:instrText xml:space="preserve"> PAGEREF _Toc242020143 \h </w:instrText>
+          <w:instrText xml:space="preserve"> PAGEREF _Toc242023963 \h </w:instrText>
         </w:r>
         <w:r>
           <w:rPr>
@@ -1756,7 +1756,7 @@
           <w14:ligatures w14:val="standardContextual"/>
         </w:rPr>
       </w:pPr>
-      <w:hyperlink w:anchor="_Toc242020144" w:history="1">
+      <w:hyperlink w:anchor="_Toc242023964" w:history="1">
         <w:r>
           <w:rPr>
             <w:rStyle w:val="Hyperlink"/>
@@ -1783,7 +1783,7 @@
             <w:noProof/>
             <w:webHidden/>
           </w:rPr>
-          <w:instrText xml:space="preserve"> PAGEREF _Toc242020144 \h </w:instrText>
+          <w:instrText xml:space="preserve"> PAGEREF _Toc242023964 \h </w:instrText>
         </w:r>
         <w:r>
           <w:rPr>
@@ -1830,7 +1830,7 @@
           <w14:ligatures w14:val="standardContextual"/>
         </w:rPr>
       </w:pPr>
-      <w:hyperlink w:anchor="_Toc242020145" w:history="1">
+      <w:hyperlink w:anchor="_Toc242023965" w:history="1">
         <w:r>
           <w:rPr>
             <w:rStyle w:val="Hyperlink"/>
@@ -1857,7 +1857,7 @@
             <w:noProof/>
             <w:webHidden/>
           </w:rPr>
-          <w:instrText xml:space="preserve"> PAGEREF _Toc242020145 \h </w:instrText>
+          <w:instrText xml:space="preserve"> PAGEREF _Toc242023965 \h </w:instrText>
         </w:r>
         <w:r>
           <w:rPr>
@@ -1889,6 +1889,80 @@
       </w:hyperlink>
     </w:p>
     <w:p>
+      <w:pPr>
+        <w:pStyle w:val="TOC1"/>
+        <w:tabs>
+          <w:tab w:val="right" w:leader="dot" w:pos="9595"/>
+        </w:tabs>
+        <w:rPr>
+          <w:rFonts w:asciiTheme="minorHAnsi" w:hAnsiTheme="minorHAnsi"/>
+          <w:noProof/>
+          <w:kern w:val="2"/>
+          <w:sz w:val="24"/>
+          <w:szCs w:val="24"/>
+          <w:lang w:val="en-IN" w:eastAsia="en-IN"/>
+          <w14:ligatures w14:val="standardContextual"/>
+        </w:rPr>
+      </w:pPr>
+      <w:hyperlink w:anchor="_Toc242023966" w:history="1">
+        <w:r>
+          <w:rPr>
+            <w:rStyle w:val="Hyperlink"/>
+            <w:noProof/>
+          </w:rPr>
+          <w:t>Appendix D — Data (from the SQL inventory)</w:t>
+        </w:r>
+        <w:r>
+          <w:rPr>
+            <w:noProof/>
+            <w:webHidden/>
+          </w:rPr>
+          <w:tab/>
+        </w:r>
+        <w:r>
+          <w:rPr>
+            <w:noProof/>
+            <w:webHidden/>
+          </w:rPr>
+          <w:fldChar w:fldCharType="begin"/>
+        </w:r>
+        <w:r>
+          <w:rPr>
+            <w:noProof/>
+            <w:webHidden/>
+          </w:rPr>
+          <w:instrText xml:space="preserve"> PAGEREF _Toc242023966 \h </w:instrText>
+        </w:r>
+        <w:r>
+          <w:rPr>
+            <w:noProof/>
+            <w:webHidden/>
+          </w:rPr>
+        </w:r>
+        <w:r>
+          <w:rPr>
+            <w:noProof/>
+            <w:webHidden/>
+          </w:rPr>
+          <w:fldChar w:fldCharType="separate"/>
+        </w:r>
+        <w:r>
+          <w:rPr>
+            <w:noProof/>
+            <w:webHidden/>
+          </w:rPr>
+          <w:t>15</w:t>
+        </w:r>
+        <w:r>
+          <w:rPr>
+            <w:noProof/>
+            <w:webHidden/>
+          </w:rPr>
+          <w:fldChar w:fldCharType="end"/>
+        </w:r>
+      </w:hyperlink>
+    </w:p>
+    <w:p>
       <w:r>
         <w:fldChar w:fldCharType="end"/>
       </w:r>
@@ -1902,7 +1976,7 @@
       <w:pPr>
         <w:pStyle w:val="Heading1"/>
       </w:pPr>
-      <w:bookmarkStart w:id="0" w:name="_Toc242020121"/>
+      <w:bookmarkStart w:id="0" w:name="_Toc242023941"/>
       <w:r>
         <w:t>1. Document control</w:t>
       </w:r>
@@ -2004,7 +2078,7 @@
               <w:rPr>
                 <w:sz w:val="17"/>
               </w:rPr>
-              <w:t>0.1 (draft)</w:t>
+              <w:t>0.2 (draft): adds Appendix D, data and SQL inventory</w:t>
             </w:r>
           </w:p>
         </w:tc>
@@ -2431,7 +2505,7 @@
       <w:pPr>
         <w:pStyle w:val="Heading1"/>
       </w:pPr>
-      <w:bookmarkStart w:id="1" w:name="_Toc242020122"/>
+      <w:bookmarkStart w:id="1" w:name="_Toc242023942"/>
       <w:r>
         <w:t>2. Executive summary</w:t>
       </w:r>
@@ -2606,7 +2680,7 @@
       <w:pPr>
         <w:pStyle w:val="Heading1"/>
       </w:pPr>
-      <w:bookmarkStart w:id="2" w:name="_Toc242020123"/>
+      <w:bookmarkStart w:id="2" w:name="_Toc242023943"/>
       <w:r>
         <w:t>3. Product overview and scope</w:t>
       </w:r>
@@ -2929,7 +3003,7 @@
           <w:noProof/>
         </w:rPr>
         <w:drawing>
-          <wp:inline distT="0" distB="0" distL="0" distR="0" wp14:anchorId="4E3CBF53" wp14:editId="0B84A92C">
+          <wp:inline distT="0" distB="0" distL="0" distR="0" wp14:anchorId="4C4FF5DF" wp14:editId="3298542A">
             <wp:extent cx="2857500" cy="714375"/>
             <wp:effectExtent l="0" t="0" r="0" b="0"/>
             <wp:docPr id="1" name="Picture 1"/>
@@ -2969,7 +3043,7 @@
       <w:pPr>
         <w:pStyle w:val="Heading1"/>
       </w:pPr>
-      <w:bookmarkStart w:id="3" w:name="_Toc242020124"/>
+      <w:bookmarkStart w:id="3" w:name="_Toc242023944"/>
       <w:r>
         <w:t>4. Actors and roles</w:t>
       </w:r>
@@ -3226,7 +3300,7 @@
       <w:pPr>
         <w:pStyle w:val="Heading1"/>
       </w:pPr>
-      <w:bookmarkStart w:id="4" w:name="_Toc242020125"/>
+      <w:bookmarkStart w:id="4" w:name="_Toc242023945"/>
       <w:r>
         <w:t>5. Business glossary</w:t>
       </w:r>
@@ -3878,7 +3952,7 @@
       <w:pPr>
         <w:pStyle w:val="Heading1"/>
       </w:pPr>
-      <w:bookmarkStart w:id="5" w:name="_Toc242020126"/>
+      <w:bookmarkStart w:id="5" w:name="_Toc242023946"/>
       <w:r>
         <w:t>6. Business information model</w:t>
       </w:r>
@@ -4292,7 +4366,7 @@
           <w:noProof/>
         </w:rPr>
         <w:drawing>
-          <wp:inline distT="0" distB="0" distL="0" distR="0" wp14:anchorId="7B5AC48A" wp14:editId="6432CDE1">
+          <wp:inline distT="0" distB="0" distL="0" distR="0" wp14:anchorId="18E1952B" wp14:editId="21245828">
             <wp:extent cx="2857500" cy="1047750"/>
             <wp:effectExtent l="0" t="0" r="0" b="0"/>
             <wp:docPr id="2" name="Picture 2"/>
@@ -4332,7 +4406,7 @@
       <w:pPr>
         <w:pStyle w:val="Heading1"/>
       </w:pPr>
-      <w:bookmarkStart w:id="6" w:name="_Toc242020127"/>
+      <w:bookmarkStart w:id="6" w:name="_Toc242023947"/>
       <w:r>
         <w:t>7. Business processes</w:t>
       </w:r>
@@ -4342,7 +4416,7 @@
       <w:pPr>
         <w:pStyle w:val="Heading2"/>
       </w:pPr>
-      <w:bookmarkStart w:id="7" w:name="_Toc242020128"/>
+      <w:bookmarkStart w:id="7" w:name="_Toc242023948"/>
       <w:r>
         <w:t>P-001 — Place a trade</w:t>
       </w:r>
@@ -4752,7 +4826,7 @@
           <w:noProof/>
         </w:rPr>
         <w:drawing>
-          <wp:inline distT="0" distB="0" distL="0" distR="0" wp14:anchorId="0C111260" wp14:editId="05FA93FE">
+          <wp:inline distT="0" distB="0" distL="0" distR="0" wp14:anchorId="0A56BF97" wp14:editId="3D00BB27">
             <wp:extent cx="2857500" cy="2066925"/>
             <wp:effectExtent l="0" t="0" r="0" b="0"/>
             <wp:docPr id="3" name="Picture 3"/>
@@ -4792,7 +4866,7 @@
       <w:pPr>
         <w:pStyle w:val="Heading2"/>
       </w:pPr>
-      <w:bookmarkStart w:id="8" w:name="_Toc242020129"/>
+      <w:bookmarkStart w:id="8" w:name="_Toc242023949"/>
       <w:r>
         <w:t>P-002 — Add funds</w:t>
       </w:r>
@@ -4894,7 +4968,7 @@
       <w:pPr>
         <w:pStyle w:val="Heading2"/>
       </w:pPr>
-      <w:bookmarkStart w:id="9" w:name="_Toc242020130"/>
+      <w:bookmarkStart w:id="9" w:name="_Toc242023950"/>
       <w:r>
         <w:t>P-003 — Register a new client</w:t>
       </w:r>
@@ -4952,7 +5026,7 @@
       <w:pPr>
         <w:pStyle w:val="Heading1"/>
       </w:pPr>
-      <w:bookmarkStart w:id="10" w:name="_Toc242020131"/>
+      <w:bookmarkStart w:id="10" w:name="_Toc242023951"/>
       <w:r>
         <w:t>8. Functional requirements by capability</w:t>
       </w:r>
@@ -4982,7 +5056,7 @@
       <w:pPr>
         <w:pStyle w:val="Heading2"/>
       </w:pPr>
-      <w:bookmarkStart w:id="11" w:name="_Toc242020132"/>
+      <w:bookmarkStart w:id="11" w:name="_Toc242023952"/>
       <w:r>
         <w:t>8.1 Account and access</w:t>
       </w:r>
@@ -6367,7 +6441,7 @@
       <w:pPr>
         <w:pStyle w:val="Heading2"/>
       </w:pPr>
-      <w:bookmarkStart w:id="12" w:name="_Toc242020133"/>
+      <w:bookmarkStart w:id="12" w:name="_Toc242023953"/>
       <w:r>
         <w:t>8.2 Wallet funding</w:t>
       </w:r>
@@ -7212,7 +7286,7 @@
       <w:pPr>
         <w:pStyle w:val="Heading2"/>
       </w:pPr>
-      <w:bookmarkStart w:id="13" w:name="_Toc242020134"/>
+      <w:bookmarkStart w:id="13" w:name="_Toc242023954"/>
       <w:r>
         <w:t>8.3 Market and pricing</w:t>
       </w:r>
@@ -7571,7 +7645,7 @@
       <w:pPr>
         <w:pStyle w:val="Heading2"/>
       </w:pPr>
-      <w:bookmarkStart w:id="14" w:name="_Toc242020135"/>
+      <w:bookmarkStart w:id="14" w:name="_Toc242023955"/>
       <w:r>
         <w:t>8.4 Trading</w:t>
       </w:r>
@@ -8794,7 +8868,7 @@
       <w:pPr>
         <w:pStyle w:val="Heading2"/>
       </w:pPr>
-      <w:bookmarkStart w:id="15" w:name="_Toc242020136"/>
+      <w:bookmarkStart w:id="15" w:name="_Toc242023956"/>
       <w:r>
         <w:t>8.5 Portfolio and dashboard</w:t>
       </w:r>
@@ -9153,7 +9227,7 @@
       <w:pPr>
         <w:pStyle w:val="Heading2"/>
       </w:pPr>
-      <w:bookmarkStart w:id="16" w:name="_Toc242020137"/>
+      <w:bookmarkStart w:id="16" w:name="_Toc242023957"/>
       <w:r>
         <w:t>8.6 Trade documents (invoices)</w:t>
       </w:r>
@@ -9728,7 +9802,7 @@
       <w:pPr>
         <w:pStyle w:val="Heading2"/>
       </w:pPr>
-      <w:bookmarkStart w:id="17" w:name="_Toc242020138"/>
+      <w:bookmarkStart w:id="17" w:name="_Toc242023958"/>
       <w:r>
         <w:t>8.7 Notifications (inbox)</w:t>
       </w:r>
@@ -10303,7 +10377,7 @@
       <w:pPr>
         <w:pStyle w:val="Heading1"/>
       </w:pPr>
-      <w:bookmarkStart w:id="18" w:name="_Toc242020139"/>
+      <w:bookmarkStart w:id="18" w:name="_Toc242023959"/>
       <w:r>
         <w:t>9. Channel differences (portal vs public API)</w:t>
       </w:r>
@@ -10760,7 +10834,7 @@
       <w:pPr>
         <w:pStyle w:val="Heading1"/>
       </w:pPr>
-      <w:bookmarkStart w:id="19" w:name="_Toc242020140"/>
+      <w:bookmarkStart w:id="19" w:name="_Toc242023960"/>
       <w:r>
         <w:t>10. Data protection and control behaviours</w:t>
       </w:r>
@@ -11013,7 +11087,7 @@
       <w:pPr>
         <w:pStyle w:val="Heading1"/>
       </w:pPr>
-      <w:bookmarkStart w:id="20" w:name="_Toc242020141"/>
+      <w:bookmarkStart w:id="20" w:name="_Toc242023961"/>
       <w:r>
         <w:t>11. Known issues and risks (not requirements)</w:t>
       </w:r>
@@ -12112,7 +12186,7 @@
       <w:pPr>
         <w:pStyle w:val="Heading1"/>
       </w:pPr>
-      <w:bookmarkStart w:id="21" w:name="_Toc242020142"/>
+      <w:bookmarkStart w:id="21" w:name="_Toc242023962"/>
       <w:r>
         <w:t>12. Open decisions for product</w:t>
       </w:r>
@@ -12964,7 +13038,7 @@
       <w:pPr>
         <w:pStyle w:val="Heading1"/>
       </w:pPr>
-      <w:bookmarkStart w:id="22" w:name="_Toc242020143"/>
+      <w:bookmarkStart w:id="22" w:name="_Toc242023963"/>
       <w:r>
         <w:t>Appendix A — Traceability</w:t>
       </w:r>
@@ -13310,7 +13384,7 @@
       <w:pPr>
         <w:pStyle w:val="Heading1"/>
       </w:pPr>
-      <w:bookmarkStart w:id="23" w:name="_Toc242020144"/>
+      <w:bookmarkStart w:id="23" w:name="_Toc242023964"/>
       <w:r>
         <w:t>Appendix B — Coverage</w:t>
       </w:r>
@@ -13588,7 +13662,7 @@
       <w:pPr>
         <w:pStyle w:val="Heading1"/>
       </w:pPr>
-      <w:bookmarkStart w:id="24" w:name="_Toc242020145"/>
+      <w:bookmarkStart w:id="24" w:name="_Toc242023965"/>
       <w:r>
         <w:t>Appendix C — How to give feedback</w:t>
       </w:r>
@@ -13840,6 +13914,399 @@
         <w:t xml:space="preserve"> to produce the agreed requirements baseline.</w:t>
       </w:r>
     </w:p>
+    <w:p>
+      <w:pPr>
+        <w:pStyle w:val="Heading1"/>
+      </w:pPr>
+      <w:bookmarkStart w:id="25" w:name="_Toc242023966"/>
+      <w:r>
+        <w:t>Appendix D — Data (from the SQL inventory)</w:t>
+      </w:r>
+      <w:bookmarkEnd w:id="25"/>
+    </w:p>
+    <w:p>
+      <w:r>
+        <w:t>Summary of the system-wide SQL inventory (</w:t>
+      </w:r>
+      <w:r>
+        <w:rPr>
+          <w:rFonts w:ascii="Consolas" w:hAnsi="Consolas"/>
+          <w:sz w:val="18"/>
+        </w:rPr>
+        <w:t>requirements/00-overview/sql-inventory.md</w:t>
+      </w:r>
+      <w:r>
+        <w:t xml:space="preserve">; spreadsheet: </w:t>
+      </w:r>
+      <w:r>
+        <w:rPr>
+          <w:rFonts w:ascii="Consolas" w:hAnsi="Consolas"/>
+          <w:sz w:val="18"/>
+        </w:rPr>
+        <w:t>sql-inventory.csv</w:t>
+      </w:r>
+      <w:r>
+        <w:t>).</w:t>
+      </w:r>
+    </w:p>
+    <w:tbl>
+      <w:tblPr>
+        <w:tblStyle w:val="TableGrid"/>
+        <w:tblW w:w="0" w:type="auto"/>
+        <w:tblLook w:val="04A0" w:firstRow="1" w:lastRow="0" w:firstColumn="1" w:lastColumn="0" w:noHBand="0" w:noVBand="1"/>
+      </w:tblPr>
+      <w:tblGrid>
+        <w:gridCol w:w="4802"/>
+        <w:gridCol w:w="4802"/>
+      </w:tblGrid>
+      <w:tr>
+        <w:trPr>
+          <w:tblHeader/>
+        </w:trPr>
+        <w:tc>
+          <w:tcPr>
+            <w:tcW w:w="4802" w:type="dxa"/>
+            <w:shd w:val="clear" w:color="auto" w:fill="E8EEF7"/>
+          </w:tcPr>
+          <w:p>
+            <w:r>
+              <w:rPr>
+                <w:b/>
+                <w:sz w:val="17"/>
+              </w:rPr>
+              <w:t>Item</w:t>
+            </w:r>
+          </w:p>
+        </w:tc>
+        <w:tc>
+          <w:tcPr>
+            <w:tcW w:w="4802" w:type="dxa"/>
+            <w:shd w:val="clear" w:color="auto" w:fill="E8EEF7"/>
+          </w:tcPr>
+          <w:p>
+            <w:r>
+              <w:rPr>
+                <w:b/>
+                <w:sz w:val="17"/>
+              </w:rPr>
+              <w:t>Value</w:t>
+            </w:r>
+          </w:p>
+        </w:tc>
+      </w:tr>
+      <w:tr>
+        <w:tc>
+          <w:tcPr>
+            <w:tcW w:w="4802" w:type="dxa"/>
+          </w:tcPr>
+          <w:p>
+            <w:r>
+              <w:rPr>
+                <w:sz w:val="17"/>
+              </w:rPr>
+              <w:t>Data store</w:t>
+            </w:r>
+          </w:p>
+        </w:tc>
+        <w:tc>
+          <w:tcPr>
+            <w:tcW w:w="4802" w:type="dxa"/>
+          </w:tcPr>
+          <w:p>
+            <w:r>
+              <w:rPr>
+                <w:sz w:val="17"/>
+              </w:rPr>
+              <w:t>One shared database used by both channels (portal back end and public API)</w:t>
+            </w:r>
+          </w:p>
+        </w:tc>
+      </w:tr>
+      <w:tr>
+        <w:tc>
+          <w:tcPr>
+            <w:tcW w:w="4802" w:type="dxa"/>
+          </w:tcPr>
+          <w:p>
+            <w:r>
+              <w:rPr>
+                <w:sz w:val="17"/>
+              </w:rPr>
+              <w:t>Business tables</w:t>
+            </w:r>
+          </w:p>
+        </w:tc>
+        <w:tc>
+          <w:tcPr>
+            <w:tcW w:w="4802" w:type="dxa"/>
+          </w:tcPr>
+          <w:p>
+            <w:r>
+              <w:rPr>
+                <w:sz w:val="17"/>
+              </w:rPr>
+              <w:t>8: Client account, Wallet, Wallet transaction, Company, Holding, Trade, Invoice, Inbox message</w:t>
+            </w:r>
+          </w:p>
+        </w:tc>
+      </w:tr>
+      <w:tr>
+        <w:tc>
+          <w:tcPr>
+            <w:tcW w:w="4802" w:type="dxa"/>
+          </w:tcPr>
+          <w:p>
+            <w:r>
+              <w:rPr>
+                <w:sz w:val="17"/>
+              </w:rPr>
+              <w:t>Stored procedures / views</w:t>
+            </w:r>
+          </w:p>
+        </w:tc>
+        <w:tc>
+          <w:tcPr>
+            <w:tcW w:w="4802" w:type="dxa"/>
+          </w:tcPr>
+          <w:p>
+            <w:r>
+              <w:rPr>
+                <w:sz w:val="17"/>
+              </w:rPr>
+              <w:t>None. All business logic is in application code.</w:t>
+            </w:r>
+          </w:p>
+        </w:tc>
+      </w:tr>
+      <w:tr>
+        <w:tc>
+          <w:tcPr>
+            <w:tcW w:w="4802" w:type="dxa"/>
+          </w:tcPr>
+          <w:p>
+            <w:r>
+              <w:rPr>
+                <w:sz w:val="17"/>
+              </w:rPr>
+              <w:t>Cross-database or external data links</w:t>
+            </w:r>
+          </w:p>
+        </w:tc>
+        <w:tc>
+          <w:tcPr>
+            <w:tcW w:w="4802" w:type="dxa"/>
+          </w:tcPr>
+          <w:p>
+            <w:r>
+              <w:rPr>
+                <w:sz w:val="17"/>
+              </w:rPr>
+              <w:t>None</w:t>
+            </w:r>
+          </w:p>
+        </w:tc>
+      </w:tr>
+      <w:tr>
+        <w:tc>
+          <w:tcPr>
+            <w:tcW w:w="4802" w:type="dxa"/>
+          </w:tcPr>
+          <w:p>
+            <w:r>
+              <w:rPr>
+                <w:sz w:val="17"/>
+              </w:rPr>
+              <w:t>SQL usage reviewed</w:t>
+            </w:r>
+          </w:p>
+        </w:tc>
+        <w:tc>
+          <w:tcPr>
+            <w:tcW w:w="4802" w:type="dxa"/>
+          </w:tcPr>
+          <w:p>
+            <w:r>
+              <w:rPr>
+                <w:sz w:val="17"/>
+              </w:rPr>
+              <w:t>Portal back end: reviewed. Public API, shared library and database: scan results awaiting review.</w:t>
+            </w:r>
+          </w:p>
+        </w:tc>
+      </w:tr>
+    </w:tbl>
+    <w:p/>
+    <w:p>
+      <w:r>
+        <w:rPr>
+          <w:b/>
+        </w:rPr>
+        <w:t>Data written by more than one component (business risk)</w:t>
+      </w:r>
+    </w:p>
+    <w:p>
+      <w:r>
+        <w:t>When two components write the same data, a business rule on that data has to be enforced in both places. If one is changed and the other isn't, they drift apart.</w:t>
+      </w:r>
+    </w:p>
+    <w:tbl>
+      <w:tblPr>
+        <w:tblStyle w:val="TableGrid"/>
+        <w:tblW w:w="0" w:type="auto"/>
+        <w:tblLook w:val="04A0" w:firstRow="1" w:lastRow="0" w:firstColumn="1" w:lastColumn="0" w:noHBand="0" w:noVBand="1"/>
+      </w:tblPr>
+      <w:tblGrid>
+        <w:gridCol w:w="3202"/>
+        <w:gridCol w:w="3202"/>
+        <w:gridCol w:w="3202"/>
+      </w:tblGrid>
+      <w:tr>
+        <w:trPr>
+          <w:tblHeader/>
+        </w:trPr>
+        <w:tc>
+          <w:tcPr>
+            <w:tcW w:w="3202" w:type="dxa"/>
+            <w:shd w:val="clear" w:color="auto" w:fill="E8EEF7"/>
+          </w:tcPr>
+          <w:p>
+            <w:r>
+              <w:rPr>
+                <w:b/>
+                <w:sz w:val="17"/>
+              </w:rPr>
+              <w:t>Data</w:t>
+            </w:r>
+          </w:p>
+        </w:tc>
+        <w:tc>
+          <w:tcPr>
+            <w:tcW w:w="3202" w:type="dxa"/>
+            <w:shd w:val="clear" w:color="auto" w:fill="E8EEF7"/>
+          </w:tcPr>
+          <w:p>
+            <w:r>
+              <w:rPr>
+                <w:b/>
+                <w:sz w:val="17"/>
+              </w:rPr>
+              <w:t>Written by</w:t>
+            </w:r>
+          </w:p>
+        </w:tc>
+        <w:tc>
+          <w:tcPr>
+            <w:tcW w:w="3202" w:type="dxa"/>
+            <w:shd w:val="clear" w:color="auto" w:fill="E8EEF7"/>
+          </w:tcPr>
+          <w:p>
+            <w:r>
+              <w:rPr>
+                <w:b/>
+                <w:sz w:val="17"/>
+              </w:rPr>
+              <w:t>Related issue</w:t>
+            </w:r>
+          </w:p>
+        </w:tc>
+      </w:tr>
+      <w:tr>
+        <w:tc>
+          <w:tcPr>
+            <w:tcW w:w="3202" w:type="dxa"/>
+          </w:tcPr>
+          <w:p>
+            <w:r>
+              <w:rPr>
+                <w:sz w:val="17"/>
+              </w:rPr>
+              <w:t>Holding, Trade, Invoice, Wallet transaction, Wallet, Client account</w:t>
+            </w:r>
+          </w:p>
+        </w:tc>
+        <w:tc>
+          <w:tcPr>
+            <w:tcW w:w="3202" w:type="dxa"/>
+          </w:tcPr>
+          <w:p>
+            <w:r>
+              <w:rPr>
+                <w:sz w:val="17"/>
+              </w:rPr>
+              <w:t xml:space="preserve">Portal back end </w:t>
+            </w:r>
+            <w:r>
+              <w:rPr>
+                <w:b/>
+                <w:sz w:val="17"/>
+              </w:rPr>
+              <w:t>and</w:t>
+            </w:r>
+            <w:r>
+              <w:rPr>
+                <w:sz w:val="17"/>
+              </w:rPr>
+              <w:t xml:space="preserve"> public API</w:t>
+            </w:r>
+          </w:p>
+        </w:tc>
+        <w:tc>
+          <w:tcPr>
+            <w:tcW w:w="3202" w:type="dxa"/>
+          </w:tcPr>
+          <w:p>
+            <w:r>
+              <w:rPr>
+                <w:sz w:val="17"/>
+              </w:rPr>
+              <w:t>D-API-001: trading, funding and registration rules are maintained twice</w:t>
+            </w:r>
+          </w:p>
+        </w:tc>
+      </w:tr>
+      <w:tr>
+        <w:tc>
+          <w:tcPr>
+            <w:tcW w:w="3202" w:type="dxa"/>
+          </w:tcPr>
+          <w:p>
+            <w:r>
+              <w:rPr>
+                <w:sz w:val="17"/>
+              </w:rPr>
+              <w:t>Inbox message</w:t>
+            </w:r>
+          </w:p>
+        </w:tc>
+        <w:tc>
+          <w:tcPr>
+            <w:tcW w:w="3202" w:type="dxa"/>
+          </w:tcPr>
+          <w:p>
+            <w:r>
+              <w:rPr>
+                <w:sz w:val="17"/>
+              </w:rPr>
+              <w:t>Portal back end and shared library (both channels send notifications through it)</w:t>
+            </w:r>
+          </w:p>
+        </w:tc>
+        <w:tc>
+          <w:tcPr>
+            <w:tcW w:w="3202" w:type="dxa"/>
+          </w:tcPr>
+          <w:p>
+            <w:r>
+              <w:rPr>
+                <w:sz w:val="17"/>
+              </w:rPr>
+              <w:t>D-WEB-002: notifications are written after the trade is saved</w:t>
+            </w:r>
+          </w:p>
+        </w:tc>
+      </w:tr>
+    </w:tbl>
+    <w:p/>
     <w:sectPr>
       <w:headerReference w:type="default" r:id="rId11"/>
       <w:footerReference w:type="default" r:id="rId12"/>
@@ -14147,31 +14614,31 @@
       </w:rPr>
     </w:lvl>
   </w:abstractNum>
-  <w:num w:numId="1" w16cid:durableId="549734185">
+  <w:num w:numId="1" w16cid:durableId="173344189">
     <w:abstractNumId w:val="8"/>
   </w:num>
-  <w:num w:numId="2" w16cid:durableId="1008487525">
+  <w:num w:numId="2" w16cid:durableId="624241714">
     <w:abstractNumId w:val="6"/>
   </w:num>
-  <w:num w:numId="3" w16cid:durableId="21052588">
+  <w:num w:numId="3" w16cid:durableId="1538393383">
     <w:abstractNumId w:val="5"/>
   </w:num>
-  <w:num w:numId="4" w16cid:durableId="322900198">
+  <w:num w:numId="4" w16cid:durableId="162939830">
     <w:abstractNumId w:val="4"/>
   </w:num>
-  <w:num w:numId="5" w16cid:durableId="1016346423">
+  <w:num w:numId="5" w16cid:durableId="1782073100">
     <w:abstractNumId w:val="7"/>
   </w:num>
-  <w:num w:numId="6" w16cid:durableId="1563444783">
+  <w:num w:numId="6" w16cid:durableId="1138761151">
     <w:abstractNumId w:val="3"/>
   </w:num>
-  <w:num w:numId="7" w16cid:durableId="393698048">
+  <w:num w:numId="7" w16cid:durableId="1201161460">
     <w:abstractNumId w:val="2"/>
   </w:num>
-  <w:num w:numId="8" w16cid:durableId="1658609991">
+  <w:num w:numId="8" w16cid:durableId="1111390781">
     <w:abstractNumId w:val="1"/>
   </w:num>
-  <w:num w:numId="9" w16cid:durableId="2142452074">
+  <w:num w:numId="9" w16cid:durableId="1438332654">
     <w:abstractNumId w:val="0"/>
   </w:num>
 </w:numbering>
@@ -25568,7 +26035,7 @@
     <w:autoRedefine/>
     <w:uiPriority w:val="39"/>
     <w:unhideWhenUsed/>
-    <w:rsid w:val="007629E6"/>
+    <w:rsid w:val="006B1BAC"/>
     <w:pPr>
       <w:spacing w:after="100"/>
     </w:pPr>
@@ -25580,7 +26047,7 @@
     <w:autoRedefine/>
     <w:uiPriority w:val="39"/>
     <w:unhideWhenUsed/>
-    <w:rsid w:val="007629E6"/>
+    <w:rsid w:val="006B1BAC"/>
     <w:pPr>
       <w:spacing w:after="100"/>
       <w:ind w:left="210"/>
@@ -25591,7 +26058,7 @@
     <w:basedOn w:val="DefaultParagraphFont"/>
     <w:uiPriority w:val="99"/>
     <w:unhideWhenUsed/>
-    <w:rsid w:val="007629E6"/>
+    <w:rsid w:val="006B1BAC"/>
     <w:rPr>
       <w:color w:val="0000FF" w:themeColor="hyperlink"/>
       <w:u w:val="single"/>

</xml_diff>